<commit_message>
Trademark cost-benefit: file both marks in Class 042 only, $700 not $1,050
</commit_message>
<xml_diff>
--- a/research/TRADEMARK_FILING_STEPS_JRS_DRR.docx
+++ b/research/TRADEMARK_FILING_STEPS_JRS_DRR.docx
@@ -495,7 +495,7 @@
               <w:spacing w:after="0"/>
             </w:pPr>
             <w:r>
-              <w:t xml:space="preserve">Classes</w:t>
+              <w:t xml:space="preserve">Class</w:t>
             </w:r>
           </w:p>
         </w:tc>
@@ -536,7 +536,7 @@
               <w:spacing w:after="0"/>
             </w:pPr>
             <w:r>
-              <w:t xml:space="preserve">042 + 035</w:t>
+              <w:t xml:space="preserve">042</w:t>
             </w:r>
           </w:p>
         </w:tc>
@@ -549,7 +549,7 @@
               <w:spacing w:after="0"/>
             </w:pPr>
             <w:r>
-              <w:t xml:space="preserve">$700</w:t>
+              <w:t xml:space="preserve">$350</w:t>
             </w:r>
           </w:p>
         </w:tc>
@@ -637,7 +637,7 @@
               <w:rPr>
                 <w:b/>
               </w:rPr>
-              <w:t xml:space="preserve">$1,050</w:t>
+              <w:t xml:space="preserve">$700</w:t>
             </w:r>
           </w:p>
         </w:tc>
@@ -654,7 +654,31 @@
         <w:spacing w:after="140"/>
       </w:pPr>
       <w:r>
-        <w:t xml:space="preserve">You could file JRS in Class 042 only and save $350. I would not. You cannot add a class to an application later: you would have to file a whole new application. Since the point is selling the asset, broader coverage is worth $350 today.</w:t>
+        <w:rPr>
+          <w:b/>
+        </w:rPr>
+        <w:t xml:space="preserve">REVISED 2026-08-12: Class 035 is dropped.</w:t>
+      </w:r>
+      <w:r>
+        <w:t xml:space="preserve"> An earlier version of this document recommended filing JRS in 042 and 035 for broader coverage. That was wrong for your situation. Class 035 is business consulting, and an intent-to-use application requires a sworn </w:t>
+      </w:r>
+      <w:r>
+        <w:rPr>
+          <w:b/>
+        </w:rPr>
+        <w:t xml:space="preserve">bona fide intention to use</w:t>
+      </w:r>
+      <w:r>
+        <w:t xml:space="preserve"> the mark in every class claimed. You dropped commercialization to do research only, so a business-consulting claim is the weakest and most attackable part of the filing. Dropping it saves $350 and removes the weak link. Full reasoning in </w:t>
+      </w:r>
+      <w:r>
+        <w:rPr>
+          <w:rFonts w:ascii="Consolas" w:hAnsi="Consolas"/>
+        </w:rPr>
+        <w:t xml:space="preserve">research/TRADEMARK_COST_BENEFIT_2026-08-12.md</w:t>
+      </w:r>
+      <w:r>
+        <w:t xml:space="preserve">.</w:t>
       </w:r>
     </w:p>
     <w:p>
@@ -1330,7 +1354,7 @@
         <w:rPr>
           <w:b/>
         </w:rPr>
-        <w:t xml:space="preserve">For JRS, Class 035</w:t>
+        <w:t xml:space="preserve">For DRR, Class 042</w:t>
       </w:r>
       <w:r>
         <w:t xml:space="preserve">: search these terms:</w:t>
@@ -1348,7 +1372,7 @@
         <w:rPr>
           <w:rFonts w:ascii="Consolas" w:hAnsi="Consolas"/>
         </w:rPr>
-        <w:t xml:space="preserve">business consultation</w:t>
+        <w:t xml:space="preserve">technical consultation</w:t>
       </w:r>
     </w:p>
     <w:p>
@@ -1363,7 +1387,7 @@
         <w:rPr>
           <w:rFonts w:ascii="Consolas" w:hAnsi="Consolas"/>
         </w:rPr>
-        <w:t xml:space="preserve">business auditing</w:t>
+        <w:t xml:space="preserve">technological analysis</w:t>
       </w:r>
     </w:p>
     <w:p>
@@ -1378,117 +1402,43 @@
         <w:rPr>
           <w:rFonts w:ascii="Consolas" w:hAnsi="Consolas"/>
         </w:rPr>
-        <w:t xml:space="preserve">compliance auditing</w:t>
-      </w:r>
-    </w:p>
-    <w:p>
-      <w:pPr>
-        <w:numPr>
-          <w:ilvl w:val="0"/>
-          <w:numId w:val="1"/>
-        </w:numPr>
-        <w:spacing w:after="60"/>
-      </w:pPr>
+        <w:t xml:space="preserve">risk assessment</w:t>
+      </w:r>
+      <w:r>
+        <w:t xml:space="preserve"> and </w:t>
+      </w:r>
       <w:r>
         <w:rPr>
           <w:rFonts w:ascii="Consolas" w:hAnsi="Consolas"/>
         </w:rPr>
-        <w:t xml:space="preserve">business risk assessment</w:t>
-      </w:r>
-    </w:p>
-    <w:p>
-      <w:pPr>
-        <w:spacing w:after="140"/>
-      </w:pPr>
-      <w:r>
-        <w:rPr>
-          <w:b/>
-        </w:rPr>
-        <w:t xml:space="preserve">For DRR, Class 042</w:t>
-      </w:r>
-      <w:r>
-        <w:t xml:space="preserve">: search these terms:</w:t>
-      </w:r>
-    </w:p>
-    <w:p>
-      <w:pPr>
-        <w:numPr>
-          <w:ilvl w:val="0"/>
-          <w:numId w:val="1"/>
-        </w:numPr>
-        <w:spacing w:after="60"/>
-      </w:pPr>
+        <w:t xml:space="preserve">technology</w:t>
+      </w:r>
+    </w:p>
+    <w:p>
+      <w:pPr>
+        <w:spacing w:after="140"/>
+      </w:pPr>
+      <w:r>
+        <w:rPr>
+          <w:b/>
+        </w:rPr>
+        <w:t xml:space="preserve">I have not verified these exact entries exist today, and I am not going to pretend otherwise.</w:t>
+      </w:r>
+      <w:r>
+        <w:t xml:space="preserve"> The ID Manual is a live database that changes, and I could not read it directly. Search the terms, read what actually comes back, and pick from what you see on the day.</w:t>
+      </w:r>
+    </w:p>
+    <w:p>
+      <w:pPr>
+        <w:spacing w:after="140"/>
+      </w:pPr>
+      <w:r>
+        <w:t xml:space="preserve">The draft custom wording sitting in </w:t>
+      </w:r>
       <w:r>
         <w:rPr>
           <w:rFonts w:ascii="Consolas" w:hAnsi="Consolas"/>
         </w:rPr>
-        <w:t xml:space="preserve">technical consultation</w:t>
-      </w:r>
-    </w:p>
-    <w:p>
-      <w:pPr>
-        <w:numPr>
-          <w:ilvl w:val="0"/>
-          <w:numId w:val="1"/>
-        </w:numPr>
-        <w:spacing w:after="60"/>
-      </w:pPr>
-      <w:r>
-        <w:rPr>
-          <w:rFonts w:ascii="Consolas" w:hAnsi="Consolas"/>
-        </w:rPr>
-        <w:t xml:space="preserve">technological analysis</w:t>
-      </w:r>
-    </w:p>
-    <w:p>
-      <w:pPr>
-        <w:numPr>
-          <w:ilvl w:val="0"/>
-          <w:numId w:val="1"/>
-        </w:numPr>
-        <w:spacing w:after="60"/>
-      </w:pPr>
-      <w:r>
-        <w:rPr>
-          <w:rFonts w:ascii="Consolas" w:hAnsi="Consolas"/>
-        </w:rPr>
-        <w:t xml:space="preserve">risk assessment</w:t>
-      </w:r>
-      <w:r>
-        <w:t xml:space="preserve"> and </w:t>
-      </w:r>
-      <w:r>
-        <w:rPr>
-          <w:rFonts w:ascii="Consolas" w:hAnsi="Consolas"/>
-        </w:rPr>
-        <w:t xml:space="preserve">technology</w:t>
-      </w:r>
-    </w:p>
-    <w:p>
-      <w:pPr>
-        <w:spacing w:after="140"/>
-      </w:pPr>
-      <w:r>
-        <w:rPr>
-          <w:b/>
-        </w:rPr>
-        <w:t xml:space="preserve">I have not verified these exact entries exist today, and I am not going to pretend otherwise.</w:t>
-      </w:r>
-      <w:r>
-        <w:t xml:space="preserve"> The ID Manual is a live database that changes, and I could not read it directly. Search the terms, read what actually comes back, and pick from what you see on the day.</w:t>
-      </w:r>
-    </w:p>
-    <w:p>
-      <w:pPr>
-        <w:spacing w:after="140"/>
-      </w:pPr>
-      <w:r>
-        <w:t xml:space="preserve">The draft custom wording sitting in </w:t>
-      </w:r>
-      <w:r>
-        <w:rPr>
-          <w:rFonts w:ascii="Consolas" w:hAnsi="Consolas"/>
-        </w:rPr>
         <w:t xml:space="preserve">TRADEMARK_FILING_DOSSIER_JRS_DRR.md</w:t>
       </w:r>
       <w:r>
@@ -1498,7 +1448,7 @@
         <w:rPr>
           <w:b/>
         </w:rPr>
-        <w:t xml:space="preserve">$600 extra across all three classes.</w:t>
+        <w:t xml:space="preserve">$400 extra across both classes.</w:t>
       </w:r>
       <w:r>
         <w:t xml:space="preserve"> Use the picker.</w:t>
@@ -1836,20 +1786,20 @@
               <w:spacing w:after="0"/>
             </w:pPr>
             <w:r>
-              <w:t xml:space="preserve">Classes</w:t>
-            </w:r>
-          </w:p>
-        </w:tc>
-        <w:tc>
-          <w:tcPr>
-            <w:tcW w:w="4680" w:type="dxa"/>
-          </w:tcPr>
-          <w:p>
-            <w:pPr>
-              <w:spacing w:after="0"/>
-            </w:pPr>
-            <w:r>
-              <w:t xml:space="preserve">042 and 035</w:t>
+              <w:t xml:space="preserve">Class</w:t>
+            </w:r>
+          </w:p>
+        </w:tc>
+        <w:tc>
+          <w:tcPr>
+            <w:tcW w:w="4680" w:type="dxa"/>
+          </w:tcPr>
+          <w:p>
+            <w:pPr>
+              <w:spacing w:after="0"/>
+            </w:pPr>
+            <w:r>
+              <w:t xml:space="preserve">042</w:t>
             </w:r>
           </w:p>
         </w:tc>
@@ -1923,7 +1873,7 @@
         <w:rPr>
           <w:b/>
         </w:rPr>
-        <w:t xml:space="preserve">$700</w:t>
+        <w:t xml:space="preserve">$350</w:t>
       </w:r>
       <w:r>
         <w:t xml:space="preserve">, and submit.</w:t>
@@ -2629,7 +2579,7 @@
         <w:t xml:space="preserve">Step 5</w:t>
       </w:r>
       <w:r>
-        <w:t xml:space="preserve">: JRS filed, Section 1(b), classes 042 and 035, $700, serial number saved</w:t>
+        <w:t xml:space="preserve">: JRS filed, Section 1(b), Class 042, $350, serial number saved</w:t>
       </w:r>
     </w:p>
     <w:p>

</xml_diff>